<commit_message>
Adding vars parsing and Makefile for all cabinets
</commit_message>
<xml_diff>
--- a/SET_210.05-0/protocol_SET_210.05-0.docx
+++ b/SET_210.05-0/protocol_SET_210.05-0.docx
@@ -5,138 +5,73 @@
     <w:p>
       <w:pPr>
         <w:pStyle w:val="afffe"/>
-      </w:pPr>
-    </w:p>
-    <w:p>
-      <w:pPr>
-        <w:pStyle w:val="afffe"/>
-      </w:pPr>
-    </w:p>
-    <w:p>
-      <w:pPr>
-        <w:pStyle w:val="afffe"/>
-      </w:pPr>
-    </w:p>
-    <w:p>
-      <w:pPr>
-        <w:pStyle w:val="afffe"/>
-      </w:pPr>
-    </w:p>
-    <w:p>
-      <w:pPr>
-        <w:pStyle w:val="afffe"/>
-      </w:pPr>
-    </w:p>
-    <w:p>
-      <w:pPr>
-        <w:pStyle w:val="afffe"/>
-      </w:pPr>
-    </w:p>
-    <w:p>
-      <w:pPr>
-        <w:pStyle w:val="afffe"/>
-      </w:pPr>
-    </w:p>
-    <w:p>
-      <w:pPr>
-        <w:pStyle w:val="afffe"/>
-      </w:pPr>
-    </w:p>
-    <w:p>
-      <w:pPr>
-        <w:pStyle w:val="afffe"/>
-      </w:pPr>
-      <w:r>
-        <w:t xml:space="preserve">Шкаф </w:t>
-      </w:r>
-      <w:r>
+        <w:jc w:val="left"/>
         <w:rPr>
           <w:lang w:val="en-US"/>
         </w:rPr>
-        <w:t xml:space="preserve">ШЭТ 210.05-0</w:t>
-      </w:r>
-      <w:r>
-        <w:t>.</w:t>
-      </w:r>
-    </w:p>
-    <w:p>
-      <w:pPr>
-        <w:pStyle w:val="afffe"/>
-      </w:pPr>
-      <w:r>
-        <w:t>Протокол наладки</w:t>
-      </w:r>
-    </w:p>
-    <w:p>
-      <w:pPr>
-        <w:pStyle w:val="af7"/>
-      </w:pPr>
-    </w:p>
-    <w:p>
-      <w:pPr>
-        <w:pStyle w:val="af7"/>
-      </w:pPr>
-    </w:p>
-    <w:p>
-      <w:pPr>
-        <w:pStyle w:val="af7"/>
-      </w:pPr>
-    </w:p>
-    <w:p>
-      <w:pPr>
-        <w:pStyle w:val="af7"/>
-      </w:pPr>
-    </w:p>
-    <w:p>
-      <w:pPr>
-        <w:pStyle w:val="af7"/>
-      </w:pPr>
-    </w:p>
-    <w:p>
-      <w:pPr>
-        <w:pStyle w:val="af7"/>
-      </w:pPr>
-    </w:p>
-    <w:p>
-      <w:pPr>
-        <w:pStyle w:val="af7"/>
-      </w:pPr>
-    </w:p>
-    <w:p>
-      <w:pPr>
-        <w:pStyle w:val="aff3"/>
+      </w:pPr>
+      <w:r>
         <w:rPr>
           <w:lang w:val="en-US"/>
         </w:rPr>
-      </w:pPr>
+        <w:t xml:space="preserve">
+          <w:r>
+            <w:t xml:space="preserve">Комплект основных защит автотрансформатора 220 кВ</w:t>
+          </w:r>
+        </w:t>
+      </w:r>
     </w:p>
     <w:p>
       <w:pPr>
-        <w:pStyle w:val="aff3"/>
+        <w:pStyle w:val="afffe"/>
+        <w:jc w:val="left"/>
         <w:rPr>
           <w:lang w:val="en-US"/>
         </w:rPr>
       </w:pPr>
-    </w:p>
-    <w:p>
-      <w:pPr>
-        <w:pStyle w:val="aff3"/>
+      <w:r>
+        <w:t>Шкаф</w:t>
+      </w:r>
+      <w:r>
         <w:rPr>
           <w:lang w:val="en-US"/>
         </w:rPr>
-      </w:pPr>
-    </w:p>
-    <w:p>
-      <w:pPr>
-        <w:pStyle w:val="aff3"/>
+        <w:t xml:space="preserve"> </w:t>
+      </w:r>
+      <w:r>
+        <w:t>электротехнический</w:t>
+      </w:r>
+      <w:r>
         <w:rPr>
           <w:lang w:val="en-US"/>
         </w:rPr>
-      </w:pPr>
+        <w:t xml:space="preserve"> </w:t>
+      </w:r>
+      <w:r>
+        <w:t>типовой</w:t>
+      </w:r>
     </w:p>
     <w:p>
       <w:pPr>
-        <w:pStyle w:val="aff3"/>
+        <w:pStyle w:val="afffe"/>
+        <w:jc w:val="left"/>
+        <w:rPr>
+          <w:color w:val="365F91" w:themeColor="accent1" w:themeShade="BF"/>
+          <w:lang w:val="en-US"/>
+        </w:rPr>
+      </w:pPr>
+      <w:r>
+        <w:rPr>
+          <w:color w:val="365F91" w:themeColor="accent1" w:themeShade="BF"/>
+          <w:lang w:val="en-US"/>
+        </w:rPr>
+        <w:t xml:space="preserve">ШЭТ 210.05-0-ЮИРЗ</w:t>
+      </w:r>
+    </w:p>
+    <w:p>
+      <w:pPr>
+        <w:pStyle w:val="afffe"/>
+        <w:jc w:val="left"/>
         <w:rPr>
           <w:lang w:val="en-US"/>
         </w:rPr>
@@ -144,32 +79,76 @@
     </w:p>
     <w:p>
       <w:pPr>
+        <w:pStyle w:val="afffe"/>
+        <w:jc w:val="left"/>
         <w:rPr>
           <w:lang w:val="en-US"/>
         </w:rPr>
       </w:pPr>
-    </w:p>
-    <w:p>
-      <w:pPr>
+      <w:r>
+        <w:t>Протокол</w:t>
+      </w:r>
+      <w:r>
         <w:rPr>
           <w:lang w:val="en-US"/>
         </w:rPr>
-      </w:pPr>
+        <w:t xml:space="preserve"> </w:t>
+      </w:r>
+      <w:r>
+        <w:t>наладки</w:t>
+      </w:r>
     </w:p>
-    <w:p/>
+    <w:p>
+      <w:pPr>
+        <w:pStyle w:val="afffe"/>
+        <w:jc w:val="left"/>
+        <w:rPr>
+          <w:color w:val="365F91" w:themeColor="accent1" w:themeShade="BF"/>
+          <w:lang w:val="en-US"/>
+        </w:rPr>
+      </w:pPr>
+      <w:r>
+        <w:rPr>
+          <w:color w:val="365F91" w:themeColor="accent1" w:themeShade="BF"/>
+          <w:lang w:val="en-US"/>
+        </w:rPr>
+        <w:t xml:space="preserve">ЮТКБ.656463.XXX-024 ПН</w:t>
+      </w:r>
+    </w:p>
+    <w:p>
+      <w:pPr>
+        <w:pStyle w:val="afffe"/>
+        <w:jc w:val="left"/>
+        <w:rPr>
+          <w:color w:val="365F91" w:themeColor="accent1" w:themeShade="BF"/>
+          <w:lang w:val="en-US"/>
+        </w:rPr>
+      </w:pPr>
+    </w:p>
+    <w:p>
+      <w:pPr>
+        <w:rPr>
+          <w:lang w:val="en-US"/>
+        </w:rPr>
+      </w:pPr>
+    </w:p>
     <w:p>
       <w:pPr>
         <w:tabs>
           <w:tab w:val="left" w:pos="825"/>
         </w:tabs>
+        <w:rPr>
+          <w:lang w:val="en-US"/>
+        </w:rPr>
         <w:sectPr>
           <w:headerReference w:type="default" r:id="rId8"/>
           <w:footerReference w:type="default" r:id="rId9"/>
           <w:headerReference w:type="first" r:id="rId10"/>
           <w:footerReference w:type="first" r:id="rId11"/>
           <w:pgSz w:w="11907" w:h="16839" w:code="9"/>
-          <w:pgMar w:top="1134" w:right="567" w:bottom="567" w:left="567" w:header="283" w:footer="283" w:gutter="851"/>
+          <w:pgMar w:top="1134" w:right="567" w:bottom="567" w:left="567" w:header="284" w:footer="284" w:gutter="851"/>
           <w:cols w:space="708"/>
+          <w:vAlign w:val="bottom"/>
           <w:titlePg/>
           <w:docGrid w:linePitch="360"/>
         </w:sectPr>
@@ -178,136 +157,26 @@
     <w:p>
       <w:pPr>
         <w:pStyle w:val="afff2"/>
-        <w:ind w:right="282"/>
+        <w:spacing w:line="360" w:lineRule="auto"/>
+        <w:ind w:right="282" w:firstLine="0"/>
         <w:rPr>
           <w:lang w:val="en-US"/>
         </w:rPr>
       </w:pPr>
     </w:p>
-    <w:tbl>
-      <w:tblPr>
-        <w:tblStyle w:val="aff7"/>
-        <w:tblpPr w:leftFromText="180" w:rightFromText="180" w:vertAnchor="text" w:horzAnchor="page" w:tblpX="8070" w:tblpY="42"/>
-        <w:tblW w:w="0" w:type="auto"/>
-        <w:tblBorders>
-          <w:top w:val="none" w:sz="0" w:space="0" w:color="auto"/>
-          <w:left w:val="none" w:sz="0" w:space="0" w:color="auto"/>
-          <w:bottom w:val="none" w:sz="0" w:space="0" w:color="auto"/>
-          <w:right w:val="none" w:sz="0" w:space="0" w:color="auto"/>
-          <w:insideH w:val="none" w:sz="0" w:space="0" w:color="auto"/>
-          <w:insideV w:val="none" w:sz="0" w:space="0" w:color="auto"/>
-        </w:tblBorders>
-        <w:tblLook w:val="04A0" w:firstRow="1" w:lastRow="0" w:firstColumn="1" w:lastColumn="0" w:noHBand="0" w:noVBand="1"/>
-      </w:tblPr>
-      <w:tblGrid>
-        <w:gridCol w:w="1551"/>
-        <w:gridCol w:w="1843"/>
-      </w:tblGrid>
-      <w:tr>
-        <w:trPr>
-          <w:trHeight w:val="558"/>
-        </w:trPr>
-        <w:tc>
-          <w:tcPr>
-            <w:tcW w:w="1413" w:type="dxa"/>
-            <w:vAlign w:val="center"/>
-          </w:tcPr>
-          <w:p>
-            <w:pPr>
-              <w:pStyle w:val="afff2"/>
-              <w:ind w:left="117" w:right="282" w:firstLine="0"/>
-              <w:jc w:val="right"/>
-            </w:pPr>
-            <w:r>
-              <w:t>Редакция</w:t>
-            </w:r>
-            <w:r>
-              <w:rPr>
-                <w:lang w:val="en-US"/>
-              </w:rPr>
-              <w:t>:</w:t>
-            </w:r>
-          </w:p>
-        </w:tc>
-        <w:tc>
-          <w:tcPr>
-            <w:tcW w:w="1843" w:type="dxa"/>
-            <w:vAlign w:val="center"/>
-          </w:tcPr>
-          <w:p>
-            <w:pPr>
-              <w:pStyle w:val="afff2"/>
-              <w:ind w:right="282" w:firstLine="0"/>
-              <w:jc w:val="left"/>
-            </w:pPr>
-            <w:proofErr w:type="gramStart"/>
-            <w:r>
-              <w:rPr>
-                <w:color w:val="A6A6A6" w:themeColor="background1" w:themeShade="A6"/>
-                <w:lang w:val="en-US"/>
-              </w:rPr>
-              <w:t xml:space="preserve">0.1</w:t>
-            </w:r>
-          </w:p>
-        </w:tc>
-      </w:tr>
-      <w:tr>
-        <w:trPr>
-          <w:trHeight w:val="413"/>
-        </w:trPr>
-        <w:tc>
-          <w:tcPr>
-            <w:tcW w:w="1413" w:type="dxa"/>
-            <w:vAlign w:val="center"/>
-          </w:tcPr>
-          <w:p>
-            <w:pPr>
-              <w:pStyle w:val="afff2"/>
-              <w:ind w:left="117" w:right="282" w:firstLine="0"/>
-              <w:jc w:val="right"/>
-            </w:pPr>
-            <w:r>
-              <w:t>Дата</w:t>
-            </w:r>
-            <w:r>
-              <w:rPr>
-                <w:lang w:val="en-US"/>
-              </w:rPr>
-              <w:t>:</w:t>
-            </w:r>
-          </w:p>
-        </w:tc>
-        <w:tc>
-          <w:tcPr>
-            <w:tcW w:w="1843" w:type="dxa"/>
-            <w:vAlign w:val="center"/>
-          </w:tcPr>
-          <w:p>
-            <w:pPr>
-              <w:pStyle w:val="afff2"/>
-              <w:ind w:right="282" w:firstLine="0"/>
-              <w:jc w:val="left"/>
-              <w:rPr>
-                <w:lang w:val="en-US"/>
-              </w:rPr>
-            </w:pPr>
-            <w:proofErr w:type="gramStart"/>
-            <w:r>
-              <w:rPr>
-                <w:color w:val="A6A6A6" w:themeColor="background1" w:themeShade="A6"/>
-                <w:lang w:val="en-US"/>
-              </w:rPr>
-              <w:t xml:space="preserve">15.09.2026</w:t>
-            </w:r>
-          </w:p>
-        </w:tc>
-      </w:tr>
-    </w:tbl>
     <w:p>
       <w:pPr>
         <w:pStyle w:val="afff2"/>
-      </w:pPr>
-      <w:r>
+        <w:spacing w:line="360" w:lineRule="auto"/>
+        <w:ind w:firstLine="0"/>
+        <w:rPr>
+          <w:lang w:val="en-US"/>
+        </w:rPr>
+      </w:pPr>
+      <w:r>
+        <w:rPr>
+          <w:lang w:val="en-US"/>
+        </w:rPr>
         <w:t xml:space="preserve">© </w:t>
       </w:r>
       <w:r>
@@ -346,73 +215,171 @@
       </w:r>
       <w:proofErr w:type="spellEnd"/>
       <w:r>
-        <w:t xml:space="preserve"> Инжиниринг</w:t>
+        <w:rPr>
+          <w:lang w:val="en-US"/>
+        </w:rPr>
+        <w:t xml:space="preserve"> </w:t>
+      </w:r>
+      <w:r>
+        <w:t>Инжиниринг</w:t>
+      </w:r>
+      <w:r>
+        <w:rPr>
+          <w:rStyle w:val="afff3"/>
+          <w:sz w:val="20"/>
+          <w:szCs w:val="16"/>
+        </w:rPr>
+        <w:ptab w:relativeTo="margin" w:alignment="right" w:leader="none"/>
+      </w:r>
+      <w:r>
+        <w:t>Редакция</w:t>
+      </w:r>
+      <w:r>
+        <w:rPr>
+          <w:lang w:val="en-US"/>
+        </w:rPr>
+        <w:t>:</w:t>
+      </w:r>
+      <w:r>
+        <w:rPr>
+          <w:lang w:val="en-US"/>
+        </w:rPr>
+        <w:t xml:space="preserve"> </w:t>
+      </w:r>
+      <w:proofErr w:type="gramStart"/>
+      <w:r>
+        <w:rPr>
+          <w:color w:val="A6A6A6" w:themeColor="background1" w:themeShade="A6"/>
+          <w:lang w:val="en-US"/>
+        </w:rPr>
+        <w:t xml:space="preserve">0.1</w:t>
       </w:r>
     </w:p>
     <w:p>
       <w:pPr>
         <w:pStyle w:val="afff2"/>
-      </w:pPr>
+        <w:spacing w:line="360" w:lineRule="auto"/>
+        <w:ind w:firstLine="0"/>
+      </w:pPr>
+      <w:r>
+        <w:t>Москва</w:t>
+      </w:r>
+      <w:r>
+        <w:rPr>
+          <w:rStyle w:val="afff3"/>
+          <w:sz w:val="20"/>
+          <w:szCs w:val="16"/>
+        </w:rPr>
+        <w:ptab w:relativeTo="margin" w:alignment="right" w:leader="none"/>
+      </w:r>
+      <w:r>
+        <w:t xml:space="preserve">Дата</w:t>
+      </w:r>
+      <w:r>
+        <w:t xml:space="preserve">: </w:t>
+      </w:r>
+      <w:proofErr w:type="gramStart"/>
+      <w:r>
+        <w:rPr>
+          <w:color w:val="A6A6A6" w:themeColor="background1" w:themeShade="A6"/>
+        </w:rPr>
+        <w:t xml:space="preserve">01.10.2026</w:t>
+      </w:r>
     </w:p>
     <w:p>
       <w:pPr>
         <w:pStyle w:val="afff2"/>
-      </w:pPr>
-      <w:r>
-        <w:t>Москва</w:t>
-      </w:r>
+        <w:spacing w:line="360" w:lineRule="auto"/>
+        <w:ind w:firstLine="0"/>
+      </w:pPr>
     </w:p>
     <w:p>
       <w:pPr>
         <w:pStyle w:val="afff2"/>
+        <w:spacing w:line="360" w:lineRule="auto"/>
+        <w:ind w:firstLine="0"/>
       </w:pPr>
     </w:p>
     <w:p>
       <w:pPr>
-        <w:pStyle w:val="afff2"/>
-      </w:pPr>
+        <w:ind w:firstLine="567"/>
+        <w:jc w:val="both"/>
+      </w:pPr>
+      <w:r>
+        <w:t>Данный документ содержит описание методик</w:t>
+      </w:r>
+      <w:r>
+        <w:t>и</w:t>
+      </w:r>
+      <w:r>
+        <w:t>, объе</w:t>
+      </w:r>
+      <w:r>
+        <w:t>м</w:t>
+      </w:r>
+      <w:r>
+        <w:t>а</w:t>
+      </w:r>
+      <w:r>
+        <w:t xml:space="preserve"> провер</w:t>
+      </w:r>
+      <w:r>
+        <w:t>ки</w:t>
+      </w:r>
+      <w:r>
+        <w:t xml:space="preserve">, </w:t>
+      </w:r>
+      <w:r>
+        <w:t xml:space="preserve">порядка проведения пусконаладочных </w:t>
+      </w:r>
+      <w:r>
+        <w:t>работ</w:t>
+      </w:r>
+      <w:r>
+        <w:t xml:space="preserve"> при новом включении и</w:t>
+      </w:r>
+      <w:r>
+        <w:t xml:space="preserve"> </w:t>
+      </w:r>
+      <w:r>
+        <w:t>других видах технического обслуживания</w:t>
+      </w:r>
+      <w:r>
+        <w:t xml:space="preserve"> шкафа электротехнического типового </w:t>
+      </w:r>
+      <w:proofErr w:type="gramStart"/>
+      <w:r>
+        <w:t xml:space="preserve">ШЭТ 210.05-0-ЮИРЗ</w:t>
+      </w:r>
+      <w:r>
+        <w:t xml:space="preserve">, </w:t>
+      </w:r>
+      <w:r>
+        <w:t xml:space="preserve">в состав которого </w:t>
+      </w:r>
+      <w:r>
+        <w:t xml:space="preserve">входит интеллектуальное электронное устройство серии «ЮНИТ-М500»</w:t>
+      </w:r>
+      <w:r>
+        <w:t xml:space="preserve">. </w:t>
+      </w:r>
     </w:p>
     <w:p>
-      <w:r>
-        <w:t xml:space="preserve">Данный документ содержит описание методики, объема и порядка проведения пусконаладочных тестов </w:t>
-      </w:r>
-      <w:r>
-        <w:t>при новом включении и периодическом техническом обслуживании микропроцессорного устройства</w:t>
-      </w:r>
-      <w:r>
-        <w:t xml:space="preserve"> «</w:t>
-      </w:r>
-      <w:r>
-        <w:t>ЮНИТ-М300-ДЗТ2</w:t>
-      </w:r>
-      <w:r>
-        <w:t>», а также включает таблицы с итоговыми показателями тестирования.</w:t>
-      </w:r>
-    </w:p>
-    <w:p>
-      <w:pPr>
-        <w:pStyle w:val="afff2"/>
-      </w:pPr>
-      <w:r>
-        <w:t>Испытуем</w:t>
-      </w:r>
-      <w:r>
-        <w:t>ое оборудование может устанавливаться</w:t>
-      </w:r>
-      <w:r>
-        <w:t xml:space="preserve"> на объекте внутри </w:t>
-      </w:r>
-      <w:r>
-        <w:t>шкафа</w:t>
-      </w:r>
-      <w:r>
-        <w:t>.</w:t>
-      </w:r>
-      <w:r>
-        <w:t xml:space="preserve"> </w:t>
-      </w:r>
-      <w:r>
-        <w:t>Помимо этого, согласно указанной методике, допускается проведение испытаний устройства в лабораторных условиях службы релейной защиты и автоматики путем моделирования рабочих условий объекта посредством подачи внешних сигналов.</w:t>
+      <w:pPr>
+        <w:ind w:firstLine="567"/>
+        <w:jc w:val="both"/>
+      </w:pPr>
+      <w:r>
+        <w:t>Д</w:t>
+      </w:r>
+      <w:r>
+        <w:t xml:space="preserve">опускается проведение испытаний в </w:t>
+      </w:r>
+      <w:r>
+        <w:t>электротехнических лабораториях</w:t>
+      </w:r>
+      <w:r>
+        <w:t xml:space="preserve"> службы релейной защиты и автоматики путем моделирования рабочих условий объекта посредством подачи внешних сигналов.</w:t>
       </w:r>
     </w:p>
     <w:p>
@@ -433,16 +400,32 @@
           <w:ilvl w:val="0"/>
           <w:numId w:val="43"/>
         </w:numPr>
-        <w:ind w:left="851" w:hanging="284"/>
-      </w:pPr>
-      <w:r>
-        <w:t>Руководство по эксплуатации общее. ЮТКБ.656122.609 РЭ «</w:t>
-      </w:r>
-      <w:r>
-        <w:t>Руководство по эксплуатации линейки ЮНИТ-М300</w:t>
-      </w:r>
-      <w:r>
-        <w:t>»;</w:t>
+        <w:tabs>
+          <w:tab w:val="left" w:pos="993"/>
+        </w:tabs>
+        <w:ind w:left="0" w:firstLine="567"/>
+      </w:pPr>
+      <w:r>
+        <w:t xml:space="preserve">Руководство по эксплуатации</w:t>
+      </w:r>
+      <w:r>
+        <w:t xml:space="preserve">. </w:t>
+      </w:r>
+      <w:proofErr w:type="gramStart"/>
+      <w:r>
+        <w:t xml:space="preserve">ЮТКБ.656463.300-024 РЭ</w:t>
+      </w:r>
+      <w:r>
+        <w:t xml:space="preserve"> «</w:t>
+      </w:r>
+      <w:r>
+        <w:t xml:space="preserve">Комплект основных защит автотрансформатора 220 кВ. Шкаф типа ШЭТ 210.05-0-ЮИРЗ</w:t>
+      </w:r>
+      <w:r>
+        <w:t>»</w:t>
+      </w:r>
+      <w:r>
+        <w:t>;</w:t>
       </w:r>
     </w:p>
     <w:p>
@@ -452,22 +435,72 @@
           <w:ilvl w:val="0"/>
           <w:numId w:val="43"/>
         </w:numPr>
-        <w:ind w:left="851" w:hanging="284"/>
+        <w:tabs>
+          <w:tab w:val="left" w:pos="993"/>
+        </w:tabs>
+        <w:ind w:left="0" w:firstLine="567"/>
+      </w:pPr>
+      <w:r>
+        <w:t>Руководство по эксплуатации общее. ЮТКБ.656122.6</w:t>
+      </w:r>
+      <w:r>
+        <w:t>11</w:t>
+      </w:r>
+      <w:r>
+        <w:t xml:space="preserve"> РЭ «</w:t>
+      </w:r>
+      <w:r>
+        <w:t>Устройство защиты и автоматики серии</w:t>
+      </w:r>
+      <w:r>
+        <w:t xml:space="preserve"> </w:t>
+      </w:r>
+      <w:r>
+        <w:t>«</w:t>
+      </w:r>
+      <w:r>
+        <w:t>ЮНИТ-М</w:t>
+      </w:r>
+      <w:r>
+        <w:t>5</w:t>
+      </w:r>
+      <w:r>
+        <w:t>00</w:t>
+      </w:r>
+      <w:r>
+        <w:t xml:space="preserve">»;</w:t>
+      </w:r>
+    </w:p>
+    <w:p>
+      <w:pPr>
+        <w:pStyle w:val="afff2"/>
+        <w:numPr>
+          <w:ilvl w:val="0"/>
+          <w:numId w:val="43"/>
+        </w:numPr>
+        <w:tabs>
+          <w:tab w:val="left" w:pos="993"/>
+        </w:tabs>
+        <w:ind w:left="0" w:firstLine="567"/>
       </w:pPr>
       <w:r>
         <w:t xml:space="preserve">Руководство по эксплуатации. </w:t>
       </w:r>
-      <w:r>
-        <w:t>ЮТКБ.656122.609 РЭ</w:t>
-      </w:r>
-      <w:r>
-        <w:t>6</w:t>
-      </w:r>
-      <w:r>
-        <w:t xml:space="preserve"> </w:t>
-      </w:r>
-      <w:r>
-        <w:t>«Микропроцессорное устройство защиты и автоматики отходящей линии «ЮНИТ-М300-ДЗТ2»;</w:t>
+      <w:proofErr w:type="gramStart"/>
+      <w:r>
+        <w:t xml:space="preserve">ЮТКБ.656122.611-06.02 РЭ</w:t>
+      </w:r>
+      <w:r>
+        <w:t xml:space="preserve"> «</w:t>
+      </w:r>
+      <w:r>
+        <w:t xml:space="preserve">Основная защита автотрансформатора напряжением 220 кВ с функциями УРОВ и АУВ. Устройство типа ЮНИТ-М500-ДЗТ</w:t>
+      </w:r>
+      <w:r>
+        <w:t>»</w:t>
+      </w:r>
+      <w:r>
+        <w:t>;</w:t>
       </w:r>
     </w:p>
     <w:p>
@@ -477,8 +510,11 @@
           <w:ilvl w:val="0"/>
           <w:numId w:val="43"/>
         </w:numPr>
+        <w:tabs>
+          <w:tab w:val="left" w:pos="993"/>
+        </w:tabs>
         <w:spacing w:before="0" w:after="0"/>
-        <w:ind w:left="851" w:hanging="284"/>
+        <w:ind w:left="0" w:firstLine="567"/>
         <w:rPr>
           <w:bCs/>
           <w:szCs w:val="22"/>
@@ -489,7 +525,42 @@
           <w:bCs/>
           <w:szCs w:val="22"/>
         </w:rPr>
-        <w:t>Инструкция эксплуатационная специальная. ЮТКБ.656122.609 ИС «Методические указания по выполнению технического обслуживания»</w:t>
+        <w:t>Инструкция эксплуатационная специальная. Методические указания по выполнению технического обслуживания</w:t>
+      </w:r>
+      <w:r>
+        <w:rPr>
+          <w:bCs/>
+          <w:szCs w:val="22"/>
+        </w:rPr>
+        <w:t xml:space="preserve"> ЮТКБ.656122.6</w:t>
+      </w:r>
+      <w:r>
+        <w:rPr>
+          <w:bCs/>
+          <w:szCs w:val="22"/>
+        </w:rPr>
+        <w:t>11</w:t>
+      </w:r>
+      <w:r>
+        <w:rPr>
+          <w:bCs/>
+          <w:szCs w:val="22"/>
+        </w:rPr>
+        <w:t xml:space="preserve"> ИС «</w:t>
+      </w:r>
+      <w:r>
+        <w:rPr>
+          <w:bCs/>
+          <w:szCs w:val="22"/>
+        </w:rPr>
+        <w:t>Устройство защиты и автоматики серии ЮНИТ-М500</w:t>
+      </w:r>
+      <w:r>
+        <w:rPr>
+          <w:bCs/>
+          <w:szCs w:val="22"/>
+        </w:rPr>
+        <w:t>»</w:t>
       </w:r>
       <w:r>
         <w:rPr>
@@ -501,31 +572,78 @@
     </w:p>
     <w:p>
       <w:pPr>
+        <w:pStyle w:val="afffb"/>
+        <w:numPr>
+          <w:ilvl w:val="0"/>
+          <w:numId w:val="43"/>
+        </w:numPr>
+        <w:tabs>
+          <w:tab w:val="left" w:pos="993"/>
+        </w:tabs>
+        <w:spacing w:before="0" w:after="0"/>
+        <w:ind w:left="0" w:firstLine="567"/>
+        <w:rPr>
+          <w:bCs/>
+          <w:szCs w:val="22"/>
+        </w:rPr>
+      </w:pPr>
+      <w:r>
+        <w:rPr>
+          <w:bCs/>
+          <w:szCs w:val="22"/>
+        </w:rPr>
+        <w:t>Руководство по эксплуатации. ЮТКБ.656132.701 РЭ «Блок интерфейсный ЮНИТ-ИЧМ»;</w:t>
+      </w:r>
+    </w:p>
+    <w:p>
+      <w:pPr>
         <w:pStyle w:val="afff2"/>
         <w:numPr>
           <w:ilvl w:val="0"/>
           <w:numId w:val="43"/>
         </w:numPr>
-        <w:ind w:left="851" w:hanging="284"/>
-      </w:pPr>
-      <w:r>
-        <w:rPr>
-          <w:highlight w:val="yellow"/>
-        </w:rPr>
-        <w:t>RU.37182817.00001.02.34.01</w:t>
-      </w:r>
-      <w:r>
-        <w:t xml:space="preserve"> Р</w:t>
-      </w:r>
-      <w:r>
-        <w:t>П П</w:t>
-      </w:r>
-      <w:r>
-        <w:t xml:space="preserve">рограммное обеспечение мониторинга и параметрирования </w:t>
-      </w:r>
-      <w:r>
-        <w:t>«ЮНИТ-СЕРВИС РЗА».</w:t>
-      </w:r>
+        <w:tabs>
+          <w:tab w:val="left" w:pos="993"/>
+        </w:tabs>
+        <w:ind w:left="0" w:firstLine="567"/>
+      </w:pPr>
+      <w:r>
+        <w:t xml:space="preserve">Руководство пользователя. </w:t>
+      </w:r>
+      <w:r>
+        <w:t xml:space="preserve">RU.37182817.00001.02.34.01 </w:t>
+      </w:r>
+      <w:r>
+        <w:t>«</w:t>
+      </w:r>
+      <w:r>
+        <w:t xml:space="preserve">Программное обеспечение мониторинга и </w:t>
+      </w:r>
+      <w:proofErr w:type="spellStart"/>
+      <w:r>
+        <w:t>параметрирования</w:t>
+      </w:r>
+      <w:proofErr w:type="spellEnd"/>
+      <w:r>
+        <w:t xml:space="preserve"> «ЮНИТ-СЕРВИС</w:t>
+      </w:r>
+      <w:r>
+        <w:t>-</w:t>
+      </w:r>
+      <w:r>
+        <w:t>РЗА»</w:t>
+      </w:r>
+      <w:r>
+        <w:t>»</w:t>
+      </w:r>
+      <w:r>
+        <w:t>.</w:t>
+      </w:r>
+    </w:p>
+    <w:p>
+      <w:pPr>
+        <w:pStyle w:val="afff2"/>
+      </w:pPr>
     </w:p>
     <w:p>
       <w:pPr>
@@ -545,7 +663,10 @@
           <w:ilvl w:val="0"/>
           <w:numId w:val="42"/>
         </w:numPr>
-        <w:ind w:left="851" w:hanging="284"/>
+        <w:tabs>
+          <w:tab w:val="left" w:pos="993"/>
+        </w:tabs>
+        <w:ind w:left="0" w:firstLine="567"/>
       </w:pPr>
       <w:r>
         <w:t>Правила устройства электроустановок. 7-е издание;</w:t>
@@ -558,7 +679,10 @@
           <w:ilvl w:val="0"/>
           <w:numId w:val="42"/>
         </w:numPr>
-        <w:ind w:left="851" w:hanging="284"/>
+        <w:tabs>
+          <w:tab w:val="left" w:pos="993"/>
+        </w:tabs>
+        <w:ind w:left="0" w:firstLine="567"/>
       </w:pPr>
       <w:r>
         <w:t>СТО 34.01-23.1-001-2017 Объем и нормы испытаний электрооборудования. Утвержден распоряжением ПАО «</w:t>
@@ -579,7 +703,10 @@
           <w:ilvl w:val="0"/>
           <w:numId w:val="42"/>
         </w:numPr>
-        <w:ind w:left="851" w:hanging="284"/>
+        <w:tabs>
+          <w:tab w:val="left" w:pos="993"/>
+        </w:tabs>
+        <w:ind w:left="0" w:firstLine="567"/>
       </w:pPr>
       <w:r>
         <w:t>РД 153-34.3-35.613-00</w:t>
@@ -684,7 +811,10 @@
           <w:ilvl w:val="0"/>
           <w:numId w:val="42"/>
         </w:numPr>
-        <w:ind w:left="851" w:hanging="284"/>
+        <w:tabs>
+          <w:tab w:val="left" w:pos="993"/>
+        </w:tabs>
+        <w:ind w:left="0" w:firstLine="567"/>
       </w:pPr>
       <w:r>
         <w:t>Правила технического обслуживания устройств и комплексов релейной защиты и автоматики». Приложение N 1 к приказу Минэнерго России от 13 июля 2020 года N 555.</w:t>
@@ -697,7 +827,10 @@
           <w:ilvl w:val="0"/>
           <w:numId w:val="42"/>
         </w:numPr>
-        <w:ind w:left="851" w:hanging="284"/>
+        <w:tabs>
+          <w:tab w:val="left" w:pos="993"/>
+        </w:tabs>
+        <w:ind w:left="0" w:firstLine="567"/>
       </w:pPr>
       <w:r>
         <w:t>СО 34.35.302-2006 Инструкция по организации и производству работ в устройствах релейной защиты и электроавтоматики элек</w:t>
@@ -719,7 +852,10 @@
           <w:ilvl w:val="0"/>
           <w:numId w:val="42"/>
         </w:numPr>
-        <w:ind w:left="851" w:hanging="284"/>
+        <w:tabs>
+          <w:tab w:val="left" w:pos="993"/>
+        </w:tabs>
+        <w:ind w:left="0" w:firstLine="567"/>
       </w:pPr>
       <w:r>
         <w:t>СТО 56947007-29.120.70.241-2017 Технические требования к микропроцессорным устройствам РЗА (с Изменениями от 11.12.2019)</w:t>
@@ -744,37 +880,16 @@
       <w:pPr>
         <w:pStyle w:val="af7"/>
         <w:spacing w:after="240"/>
-      </w:pPr>
-      <w:r>
-        <w:t>Согласно Правилам технического обслуживания устройств и комплексов релейной защиты и автоматики, утвержденным приказом Минэнерго от 13.07.2020 г. N 555 техническое обслуживание устройств РЗА должно выполняться с периодичностью, указанной в таблице 1.</w:t>
-      </w:r>
-    </w:p>
-    <w:p>
-      <w:pPr>
-        <w:rPr>
-          <w:bCs/>
-          <w:szCs w:val="22"/>
-        </w:rPr>
-      </w:pPr>
-    </w:p>
-    <w:p>
-      <w:pPr>
-        <w:tabs>
-          <w:tab w:val="left" w:pos="6945"/>
-        </w:tabs>
-      </w:pPr>
-      <w:r>
-        <w:tab/>
-      </w:r>
-    </w:p>
-    <w:p>
-      <w:pPr>
-        <w:tabs>
-          <w:tab w:val="left" w:pos="6945"/>
-        </w:tabs>
-      </w:pPr>
-      <w:r>
-        <w:tab/>
+        <w:ind w:firstLine="567"/>
+      </w:pPr>
+      <w:r>
+        <w:t>Согласно Правилам технического обслуживания устройств и комплексов релейной защиты и автоматики, утвержденным приказом Минэнерго от 13.07.2020 г. N 555 техническое обслуживание устройств РЗА должно выполняться с периодичностью, указанной в таблице</w:t>
+      </w:r>
+      <w:r>
+        <w:t> </w:t>
+      </w:r>
+      <w:r>
+        <w:t>1.</w:t>
       </w:r>
     </w:p>
     <w:p>
@@ -2284,8 +2399,29 @@
         <w:pStyle w:val="af7"/>
         <w:spacing w:after="240"/>
       </w:pPr>
-      <w:r>
-        <w:t>Для устройства «ЮНИТ-М300» объем проверок для различных видов технического обслуживания приведен в таблице 2.</w:t>
+    </w:p>
+    <w:p>
+      <w:pPr>
+        <w:pStyle w:val="af7"/>
+        <w:spacing w:after="240"/>
+        <w:ind w:firstLine="567"/>
+        <w:jc w:val="both"/>
+      </w:pPr>
+      <w:r>
+        <w:t xml:space="preserve">Для </w:t>
+      </w:r>
+      <w:proofErr w:type="gramStart"/>
+      <w:r>
+        <w:t xml:space="preserve">ШЭТ 210.05-0-ЮИРЗ</w:t>
+      </w:r>
+      <w:r>
+        <w:t xml:space="preserve"> объем проверок для различных видов технического обслуживания приведен в таблице</w:t>
+      </w:r>
+      <w:r>
+        <w:t> </w:t>
+      </w:r>
+      <w:r>
+        <w:t>2.</w:t>
       </w:r>
     </w:p>
     <w:p>
@@ -2422,10 +2558,16 @@
             <w:vAlign w:val="center"/>
           </w:tcPr>
           <w:p>
+            <w:pPr>
+              <w:rPr>
+                <w:highlight w:val="yellow"/>
+              </w:rPr>
+            </w:pPr>
             <w:r>
               <w:rPr>
                 <w:b/>
                 <w:bCs/>
+                <w:highlight w:val="yellow"/>
               </w:rPr>
               <w:t>5</w:t>
             </w:r>
@@ -2437,10 +2579,16 @@
             <w:vAlign w:val="center"/>
           </w:tcPr>
           <w:p>
+            <w:pPr>
+              <w:rPr>
+                <w:highlight w:val="yellow"/>
+              </w:rPr>
+            </w:pPr>
             <w:r>
               <w:rPr>
                 <w:b/>
                 <w:bCs/>
+                <w:highlight w:val="yellow"/>
               </w:rPr>
               <w:t>6</w:t>
             </w:r>
@@ -2452,26 +2600,18 @@
             <w:vAlign w:val="center"/>
           </w:tcPr>
           <w:p>
+            <w:pPr>
+              <w:rPr>
+                <w:highlight w:val="yellow"/>
+              </w:rPr>
+            </w:pPr>
             <w:r>
               <w:rPr>
                 <w:b/>
                 <w:bCs/>
-              </w:rPr>
-              <w:t>7.1</w:t>
-            </w:r>
-            <w:r>
-              <w:rPr>
-                <w:b/>
-                <w:bCs/>
-              </w:rPr>
-              <w:t>,</w:t>
-            </w:r>
-            <w:r>
-              <w:rPr>
-                <w:b/>
-                <w:bCs/>
-              </w:rPr>
-              <w:t xml:space="preserve"> 7.2</w:t>
+                <w:highlight w:val="yellow"/>
+              </w:rPr>
+              <w:t>7.1, 7.2</w:t>
             </w:r>
           </w:p>
         </w:tc>
@@ -2481,10 +2621,16 @@
             <w:vAlign w:val="center"/>
           </w:tcPr>
           <w:p>
+            <w:pPr>
+              <w:rPr>
+                <w:highlight w:val="yellow"/>
+              </w:rPr>
+            </w:pPr>
             <w:r>
               <w:rPr>
                 <w:b/>
                 <w:bCs/>
+                <w:highlight w:val="yellow"/>
               </w:rPr>
               <w:t>7.3</w:t>
             </w:r>
@@ -2496,26 +2642,18 @@
             <w:vAlign w:val="center"/>
           </w:tcPr>
           <w:p>
+            <w:pPr>
+              <w:rPr>
+                <w:highlight w:val="yellow"/>
+              </w:rPr>
+            </w:pPr>
             <w:r>
               <w:rPr>
                 <w:b/>
                 <w:bCs/>
-              </w:rPr>
-              <w:t>7.4</w:t>
-            </w:r>
-            <w:r>
-              <w:rPr>
-                <w:b/>
-                <w:bCs/>
-              </w:rPr>
-              <w:t>,</w:t>
-            </w:r>
-            <w:r>
-              <w:rPr>
-                <w:b/>
-                <w:bCs/>
-              </w:rPr>
-              <w:t xml:space="preserve"> 7.5</w:t>
+                <w:highlight w:val="yellow"/>
+              </w:rPr>
+              <w:t>7.4, 7.5</w:t>
             </w:r>
           </w:p>
         </w:tc>
@@ -2525,10 +2663,16 @@
             <w:vAlign w:val="center"/>
           </w:tcPr>
           <w:p>
+            <w:pPr>
+              <w:rPr>
+                <w:highlight w:val="yellow"/>
+              </w:rPr>
+            </w:pPr>
             <w:r>
               <w:rPr>
                 <w:b/>
                 <w:bCs/>
+                <w:highlight w:val="yellow"/>
               </w:rPr>
               <w:t>8-11</w:t>
             </w:r>
@@ -2540,10 +2684,16 @@
             <w:vAlign w:val="center"/>
           </w:tcPr>
           <w:p>
+            <w:pPr>
+              <w:rPr>
+                <w:highlight w:val="yellow"/>
+              </w:rPr>
+            </w:pPr>
             <w:r>
               <w:rPr>
                 <w:b/>
                 <w:bCs/>
+                <w:highlight w:val="yellow"/>
               </w:rPr>
               <w:t>12</w:t>
             </w:r>
@@ -2555,26 +2705,18 @@
             <w:vAlign w:val="center"/>
           </w:tcPr>
           <w:p>
+            <w:pPr>
+              <w:rPr>
+                <w:highlight w:val="yellow"/>
+              </w:rPr>
+            </w:pPr>
             <w:r>
               <w:rPr>
                 <w:b/>
                 <w:bCs/>
-              </w:rPr>
-              <w:t>13</w:t>
-            </w:r>
-            <w:r>
-              <w:rPr>
-                <w:b/>
-                <w:bCs/>
-              </w:rPr>
-              <w:t>,</w:t>
-            </w:r>
-            <w:r>
-              <w:rPr>
-                <w:b/>
-                <w:bCs/>
-              </w:rPr>
-              <w:t xml:space="preserve"> 14</w:t>
+                <w:highlight w:val="yellow"/>
+              </w:rPr>
+              <w:t>13, 14</w:t>
             </w:r>
           </w:p>
         </w:tc>
@@ -2584,10 +2726,16 @@
             <w:vAlign w:val="center"/>
           </w:tcPr>
           <w:p>
+            <w:pPr>
+              <w:rPr>
+                <w:highlight w:val="yellow"/>
+              </w:rPr>
+            </w:pPr>
             <w:r>
               <w:rPr>
                 <w:b/>
                 <w:bCs/>
+                <w:highlight w:val="yellow"/>
               </w:rPr>
               <w:t>15-20</w:t>
             </w:r>
@@ -2599,10 +2747,16 @@
             <w:vAlign w:val="center"/>
           </w:tcPr>
           <w:p>
+            <w:pPr>
+              <w:rPr>
+                <w:highlight w:val="yellow"/>
+              </w:rPr>
+            </w:pPr>
             <w:r>
               <w:rPr>
                 <w:b/>
                 <w:bCs/>
+                <w:highlight w:val="yellow"/>
               </w:rPr>
               <w:t>21.1</w:t>
             </w:r>
@@ -2614,10 +2768,16 @@
             <w:vAlign w:val="center"/>
           </w:tcPr>
           <w:p>
+            <w:pPr>
+              <w:rPr>
+                <w:highlight w:val="yellow"/>
+              </w:rPr>
+            </w:pPr>
             <w:r>
               <w:rPr>
                 <w:b/>
                 <w:bCs/>
+                <w:highlight w:val="yellow"/>
               </w:rPr>
               <w:t>21.2</w:t>
             </w:r>
@@ -2629,10 +2789,16 @@
             <w:vAlign w:val="center"/>
           </w:tcPr>
           <w:p>
+            <w:pPr>
+              <w:rPr>
+                <w:highlight w:val="yellow"/>
+              </w:rPr>
+            </w:pPr>
             <w:r>
               <w:rPr>
                 <w:b/>
                 <w:bCs/>
+                <w:highlight w:val="yellow"/>
               </w:rPr>
               <w:t>21.3</w:t>
             </w:r>
@@ -2644,10 +2810,16 @@
             <w:vAlign w:val="center"/>
           </w:tcPr>
           <w:p>
+            <w:pPr>
+              <w:rPr>
+                <w:highlight w:val="yellow"/>
+              </w:rPr>
+            </w:pPr>
             <w:r>
               <w:rPr>
                 <w:b/>
                 <w:bCs/>
+                <w:highlight w:val="yellow"/>
               </w:rPr>
               <w:t>21.4</w:t>
             </w:r>
@@ -2670,7 +2842,15 @@
             <w:tcW w:w="567" w:type="dxa"/>
           </w:tcPr>
           <w:p>
-            <w:r>
+            <w:pPr>
+              <w:rPr>
+                <w:highlight w:val="yellow"/>
+              </w:rPr>
+            </w:pPr>
+            <w:r>
+              <w:rPr>
+                <w:highlight w:val="yellow"/>
+              </w:rPr>
               <w:t>+</w:t>
             </w:r>
           </w:p>
@@ -2680,7 +2860,15 @@
             <w:tcW w:w="567" w:type="dxa"/>
           </w:tcPr>
           <w:p>
-            <w:r>
+            <w:pPr>
+              <w:rPr>
+                <w:highlight w:val="yellow"/>
+              </w:rPr>
+            </w:pPr>
+            <w:r>
+              <w:rPr>
+                <w:highlight w:val="yellow"/>
+              </w:rPr>
               <w:t>+</w:t>
             </w:r>
           </w:p>
@@ -2690,7 +2878,15 @@
             <w:tcW w:w="567" w:type="dxa"/>
           </w:tcPr>
           <w:p>
-            <w:r>
+            <w:pPr>
+              <w:rPr>
+                <w:highlight w:val="yellow"/>
+              </w:rPr>
+            </w:pPr>
+            <w:r>
+              <w:rPr>
+                <w:highlight w:val="yellow"/>
+              </w:rPr>
               <w:t>+</w:t>
             </w:r>
           </w:p>
@@ -2702,11 +2898,13 @@
           <w:p>
             <w:pPr>
               <w:rPr>
+                <w:highlight w:val="yellow"/>
                 <w:lang w:val="en-US"/>
               </w:rPr>
             </w:pPr>
             <w:r>
               <w:rPr>
+                <w:highlight w:val="yellow"/>
                 <w:lang w:val="en-US"/>
               </w:rPr>
               <w:t>-</w:t>
@@ -2718,7 +2916,15 @@
             <w:tcW w:w="567" w:type="dxa"/>
           </w:tcPr>
           <w:p>
-            <w:r>
+            <w:pPr>
+              <w:rPr>
+                <w:highlight w:val="yellow"/>
+              </w:rPr>
+            </w:pPr>
+            <w:r>
+              <w:rPr>
+                <w:highlight w:val="yellow"/>
+              </w:rPr>
               <w:t>+</w:t>
             </w:r>
           </w:p>
@@ -2730,11 +2936,13 @@
           <w:p>
             <w:pPr>
               <w:rPr>
+                <w:highlight w:val="yellow"/>
                 <w:lang w:val="en-US"/>
               </w:rPr>
             </w:pPr>
             <w:r>
               <w:rPr>
+                <w:highlight w:val="yellow"/>
                 <w:lang w:val="en-US"/>
               </w:rPr>
               <w:t>-</w:t>
@@ -2746,7 +2954,15 @@
             <w:tcW w:w="567" w:type="dxa"/>
           </w:tcPr>
           <w:p>
-            <w:r>
+            <w:pPr>
+              <w:rPr>
+                <w:highlight w:val="yellow"/>
+              </w:rPr>
+            </w:pPr>
+            <w:r>
+              <w:rPr>
+                <w:highlight w:val="yellow"/>
+              </w:rPr>
               <w:t>+</w:t>
             </w:r>
           </w:p>
@@ -2758,11 +2974,13 @@
           <w:p>
             <w:pPr>
               <w:rPr>
+                <w:highlight w:val="yellow"/>
                 <w:lang w:val="en-US"/>
               </w:rPr>
             </w:pPr>
             <w:r>
               <w:rPr>
+                <w:highlight w:val="yellow"/>
                 <w:lang w:val="en-US"/>
               </w:rPr>
               <w:t>-</w:t>
@@ -2774,7 +2992,15 @@
             <w:tcW w:w="567" w:type="dxa"/>
           </w:tcPr>
           <w:p>
-            <w:r>
+            <w:pPr>
+              <w:rPr>
+                <w:highlight w:val="yellow"/>
+              </w:rPr>
+            </w:pPr>
+            <w:r>
+              <w:rPr>
+                <w:highlight w:val="yellow"/>
+              </w:rPr>
               <w:t>+</w:t>
             </w:r>
           </w:p>
@@ -2784,7 +3010,15 @@
             <w:tcW w:w="709" w:type="dxa"/>
           </w:tcPr>
           <w:p>
-            <w:r>
+            <w:pPr>
+              <w:rPr>
+                <w:highlight w:val="yellow"/>
+              </w:rPr>
+            </w:pPr>
+            <w:r>
+              <w:rPr>
+                <w:highlight w:val="yellow"/>
+              </w:rPr>
               <w:t>+</w:t>
             </w:r>
           </w:p>
@@ -2796,11 +3030,13 @@
           <w:p>
             <w:pPr>
               <w:rPr>
+                <w:highlight w:val="yellow"/>
                 <w:lang w:val="en-US"/>
               </w:rPr>
             </w:pPr>
             <w:r>
               <w:rPr>
+                <w:highlight w:val="yellow"/>
                 <w:lang w:val="en-US"/>
               </w:rPr>
               <w:t>-</w:t>
@@ -2814,11 +3050,13 @@
           <w:p>
             <w:pPr>
               <w:rPr>
+                <w:highlight w:val="yellow"/>
                 <w:lang w:val="en-US"/>
               </w:rPr>
             </w:pPr>
             <w:r>
               <w:rPr>
+                <w:highlight w:val="yellow"/>
                 <w:lang w:val="en-US"/>
               </w:rPr>
               <w:t>-</w:t>
@@ -2830,7 +3068,15 @@
             <w:tcW w:w="709" w:type="dxa"/>
           </w:tcPr>
           <w:p>
-            <w:r>
+            <w:pPr>
+              <w:rPr>
+                <w:highlight w:val="yellow"/>
+              </w:rPr>
+            </w:pPr>
+            <w:r>
+              <w:rPr>
+                <w:highlight w:val="yellow"/>
+              </w:rPr>
               <w:t>+</w:t>
             </w:r>
           </w:p>
@@ -2852,7 +3098,15 @@
             <w:tcW w:w="567" w:type="dxa"/>
           </w:tcPr>
           <w:p>
-            <w:r>
+            <w:pPr>
+              <w:rPr>
+                <w:highlight w:val="yellow"/>
+              </w:rPr>
+            </w:pPr>
+            <w:r>
+              <w:rPr>
+                <w:highlight w:val="yellow"/>
+              </w:rPr>
               <w:t>+</w:t>
             </w:r>
           </w:p>
@@ -2862,7 +3116,15 @@
             <w:tcW w:w="567" w:type="dxa"/>
           </w:tcPr>
           <w:p>
-            <w:r>
+            <w:pPr>
+              <w:rPr>
+                <w:highlight w:val="yellow"/>
+              </w:rPr>
+            </w:pPr>
+            <w:r>
+              <w:rPr>
+                <w:highlight w:val="yellow"/>
+              </w:rPr>
               <w:t>+</w:t>
             </w:r>
           </w:p>
@@ -2872,7 +3134,15 @@
             <w:tcW w:w="567" w:type="dxa"/>
           </w:tcPr>
           <w:p>
-            <w:r>
+            <w:pPr>
+              <w:rPr>
+                <w:highlight w:val="yellow"/>
+              </w:rPr>
+            </w:pPr>
+            <w:r>
+              <w:rPr>
+                <w:highlight w:val="yellow"/>
+              </w:rPr>
               <w:t>+</w:t>
             </w:r>
           </w:p>
@@ -2884,11 +3154,13 @@
           <w:p>
             <w:pPr>
               <w:rPr>
+                <w:highlight w:val="yellow"/>
                 <w:lang w:val="en-US"/>
               </w:rPr>
             </w:pPr>
             <w:r>
               <w:rPr>
+                <w:highlight w:val="yellow"/>
                 <w:lang w:val="en-US"/>
               </w:rPr>
               <w:t>-</w:t>
@@ -2902,11 +3174,13 @@
           <w:p>
             <w:pPr>
               <w:rPr>
+                <w:highlight w:val="yellow"/>
                 <w:lang w:val="en-US"/>
               </w:rPr>
             </w:pPr>
             <w:r>
               <w:rPr>
+                <w:highlight w:val="yellow"/>
                 <w:lang w:val="en-US"/>
               </w:rPr>
               <w:t>-</w:t>
@@ -2920,11 +3194,13 @@
           <w:p>
             <w:pPr>
               <w:rPr>
+                <w:highlight w:val="yellow"/>
                 <w:lang w:val="en-US"/>
               </w:rPr>
             </w:pPr>
             <w:r>
               <w:rPr>
+                <w:highlight w:val="yellow"/>
                 <w:lang w:val="en-US"/>
               </w:rPr>
               <w:t>-</w:t>
@@ -2938,11 +3214,13 @@
           <w:p>
             <w:pPr>
               <w:rPr>
+                <w:highlight w:val="yellow"/>
                 <w:lang w:val="en-US"/>
               </w:rPr>
             </w:pPr>
             <w:r>
               <w:rPr>
+                <w:highlight w:val="yellow"/>
                 <w:lang w:val="en-US"/>
               </w:rPr>
               <w:t>-</w:t>
@@ -2956,11 +3234,13 @@
           <w:p>
             <w:pPr>
               <w:rPr>
+                <w:highlight w:val="yellow"/>
                 <w:lang w:val="en-US"/>
               </w:rPr>
             </w:pPr>
             <w:r>
               <w:rPr>
+                <w:highlight w:val="yellow"/>
                 <w:lang w:val="en-US"/>
               </w:rPr>
               <w:t>-</w:t>
@@ -2972,7 +3252,15 @@
             <w:tcW w:w="567" w:type="dxa"/>
           </w:tcPr>
           <w:p>
-            <w:r>
+            <w:pPr>
+              <w:rPr>
+                <w:highlight w:val="yellow"/>
+              </w:rPr>
+            </w:pPr>
+            <w:r>
+              <w:rPr>
+                <w:highlight w:val="yellow"/>
+              </w:rPr>
               <w:t>+</w:t>
             </w:r>
           </w:p>
@@ -2982,7 +3270,15 @@
             <w:tcW w:w="709" w:type="dxa"/>
           </w:tcPr>
           <w:p>
-            <w:r>
+            <w:pPr>
+              <w:rPr>
+                <w:highlight w:val="yellow"/>
+              </w:rPr>
+            </w:pPr>
+            <w:r>
+              <w:rPr>
+                <w:highlight w:val="yellow"/>
+              </w:rPr>
               <w:t>+</w:t>
             </w:r>
           </w:p>
@@ -2994,11 +3290,13 @@
           <w:p>
             <w:pPr>
               <w:rPr>
+                <w:highlight w:val="yellow"/>
                 <w:lang w:val="en-US"/>
               </w:rPr>
             </w:pPr>
             <w:r>
               <w:rPr>
+                <w:highlight w:val="yellow"/>
                 <w:lang w:val="en-US"/>
               </w:rPr>
               <w:t>-</w:t>
@@ -3012,11 +3310,13 @@
           <w:p>
             <w:pPr>
               <w:rPr>
+                <w:highlight w:val="yellow"/>
                 <w:lang w:val="en-US"/>
               </w:rPr>
             </w:pPr>
             <w:r>
               <w:rPr>
+                <w:highlight w:val="yellow"/>
                 <w:lang w:val="en-US"/>
               </w:rPr>
               <w:t>-</w:t>
@@ -3028,7 +3328,15 @@
             <w:tcW w:w="709" w:type="dxa"/>
           </w:tcPr>
           <w:p>
-            <w:r>
+            <w:pPr>
+              <w:rPr>
+                <w:highlight w:val="yellow"/>
+              </w:rPr>
+            </w:pPr>
+            <w:r>
+              <w:rPr>
+                <w:highlight w:val="yellow"/>
+              </w:rPr>
               <w:t>+</w:t>
             </w:r>
           </w:p>
@@ -3050,7 +3358,15 @@
             <w:tcW w:w="567" w:type="dxa"/>
           </w:tcPr>
           <w:p>
-            <w:r>
+            <w:pPr>
+              <w:rPr>
+                <w:highlight w:val="yellow"/>
+              </w:rPr>
+            </w:pPr>
+            <w:r>
+              <w:rPr>
+                <w:highlight w:val="yellow"/>
+              </w:rPr>
               <w:t>+</w:t>
             </w:r>
           </w:p>
@@ -3060,7 +3376,15 @@
             <w:tcW w:w="567" w:type="dxa"/>
           </w:tcPr>
           <w:p>
-            <w:r>
+            <w:pPr>
+              <w:rPr>
+                <w:highlight w:val="yellow"/>
+              </w:rPr>
+            </w:pPr>
+            <w:r>
+              <w:rPr>
+                <w:highlight w:val="yellow"/>
+              </w:rPr>
               <w:t>+</w:t>
             </w:r>
           </w:p>
@@ -3070,7 +3394,15 @@
             <w:tcW w:w="567" w:type="dxa"/>
           </w:tcPr>
           <w:p>
-            <w:r>
+            <w:pPr>
+              <w:rPr>
+                <w:highlight w:val="yellow"/>
+              </w:rPr>
+            </w:pPr>
+            <w:r>
+              <w:rPr>
+                <w:highlight w:val="yellow"/>
+              </w:rPr>
               <w:t>+</w:t>
             </w:r>
           </w:p>
@@ -3082,11 +3414,13 @@
           <w:p>
             <w:pPr>
               <w:rPr>
+                <w:highlight w:val="yellow"/>
                 <w:lang w:val="en-US"/>
               </w:rPr>
             </w:pPr>
             <w:r>
               <w:rPr>
+                <w:highlight w:val="yellow"/>
                 <w:lang w:val="en-US"/>
               </w:rPr>
               <w:t>-</w:t>
@@ -3098,7 +3432,15 @@
             <w:tcW w:w="567" w:type="dxa"/>
           </w:tcPr>
           <w:p>
-            <w:r>
+            <w:pPr>
+              <w:rPr>
+                <w:highlight w:val="yellow"/>
+              </w:rPr>
+            </w:pPr>
+            <w:r>
+              <w:rPr>
+                <w:highlight w:val="yellow"/>
+              </w:rPr>
               <w:t>+</w:t>
             </w:r>
           </w:p>
@@ -3110,11 +3452,13 @@
           <w:p>
             <w:pPr>
               <w:rPr>
+                <w:highlight w:val="yellow"/>
                 <w:lang w:val="en-US"/>
               </w:rPr>
             </w:pPr>
             <w:r>
               <w:rPr>
+                <w:highlight w:val="yellow"/>
                 <w:lang w:val="en-US"/>
               </w:rPr>
               <w:t>-</w:t>
@@ -3126,7 +3470,15 @@
             <w:tcW w:w="567" w:type="dxa"/>
           </w:tcPr>
           <w:p>
-            <w:r>
+            <w:pPr>
+              <w:rPr>
+                <w:highlight w:val="yellow"/>
+              </w:rPr>
+            </w:pPr>
+            <w:r>
+              <w:rPr>
+                <w:highlight w:val="yellow"/>
+              </w:rPr>
               <w:t>+</w:t>
             </w:r>
           </w:p>
@@ -3136,7 +3488,15 @@
             <w:tcW w:w="567" w:type="dxa"/>
           </w:tcPr>
           <w:p>
-            <w:r>
+            <w:pPr>
+              <w:rPr>
+                <w:highlight w:val="yellow"/>
+              </w:rPr>
+            </w:pPr>
+            <w:r>
+              <w:rPr>
+                <w:highlight w:val="yellow"/>
+              </w:rPr>
               <w:t>+</w:t>
             </w:r>
           </w:p>
@@ -3146,7 +3506,15 @@
             <w:tcW w:w="567" w:type="dxa"/>
           </w:tcPr>
           <w:p>
-            <w:r>
+            <w:pPr>
+              <w:rPr>
+                <w:highlight w:val="yellow"/>
+              </w:rPr>
+            </w:pPr>
+            <w:r>
+              <w:rPr>
+                <w:highlight w:val="yellow"/>
+              </w:rPr>
               <w:t>+</w:t>
             </w:r>
           </w:p>
@@ -3156,7 +3524,15 @@
             <w:tcW w:w="709" w:type="dxa"/>
           </w:tcPr>
           <w:p>
-            <w:r>
+            <w:pPr>
+              <w:rPr>
+                <w:highlight w:val="yellow"/>
+              </w:rPr>
+            </w:pPr>
+            <w:r>
+              <w:rPr>
+                <w:highlight w:val="yellow"/>
+              </w:rPr>
               <w:t>+</w:t>
             </w:r>
           </w:p>
@@ -3166,7 +3542,15 @@
             <w:tcW w:w="708" w:type="dxa"/>
           </w:tcPr>
           <w:p>
-            <w:r>
+            <w:pPr>
+              <w:rPr>
+                <w:highlight w:val="yellow"/>
+              </w:rPr>
+            </w:pPr>
+            <w:r>
+              <w:rPr>
+                <w:highlight w:val="yellow"/>
+              </w:rPr>
               <w:t>+</w:t>
             </w:r>
           </w:p>
@@ -3176,7 +3560,15 @@
             <w:tcW w:w="709" w:type="dxa"/>
           </w:tcPr>
           <w:p>
-            <w:r>
+            <w:pPr>
+              <w:rPr>
+                <w:highlight w:val="yellow"/>
+              </w:rPr>
+            </w:pPr>
+            <w:r>
+              <w:rPr>
+                <w:highlight w:val="yellow"/>
+              </w:rPr>
               <w:t>+</w:t>
             </w:r>
           </w:p>
@@ -3186,7 +3578,15 @@
             <w:tcW w:w="709" w:type="dxa"/>
           </w:tcPr>
           <w:p>
-            <w:r>
+            <w:pPr>
+              <w:rPr>
+                <w:highlight w:val="yellow"/>
+              </w:rPr>
+            </w:pPr>
+            <w:r>
+              <w:rPr>
+                <w:highlight w:val="yellow"/>
+              </w:rPr>
               <w:t>+</w:t>
             </w:r>
           </w:p>
@@ -3208,7 +3608,15 @@
             <w:tcW w:w="567" w:type="dxa"/>
           </w:tcPr>
           <w:p>
-            <w:r>
+            <w:pPr>
+              <w:rPr>
+                <w:highlight w:val="yellow"/>
+              </w:rPr>
+            </w:pPr>
+            <w:r>
+              <w:rPr>
+                <w:highlight w:val="yellow"/>
+              </w:rPr>
               <w:t>+</w:t>
             </w:r>
           </w:p>
@@ -3220,11 +3628,13 @@
           <w:p>
             <w:pPr>
               <w:rPr>
+                <w:highlight w:val="yellow"/>
                 <w:lang w:val="en-US"/>
               </w:rPr>
             </w:pPr>
             <w:r>
               <w:rPr>
+                <w:highlight w:val="yellow"/>
                 <w:lang w:val="en-US"/>
               </w:rPr>
               <w:t>-</w:t>
@@ -3236,7 +3646,15 @@
             <w:tcW w:w="567" w:type="dxa"/>
           </w:tcPr>
           <w:p>
-            <w:r>
+            <w:pPr>
+              <w:rPr>
+                <w:highlight w:val="yellow"/>
+              </w:rPr>
+            </w:pPr>
+            <w:r>
+              <w:rPr>
+                <w:highlight w:val="yellow"/>
+              </w:rPr>
               <w:t>+</w:t>
             </w:r>
           </w:p>
@@ -3246,7 +3664,15 @@
             <w:tcW w:w="567" w:type="dxa"/>
           </w:tcPr>
           <w:p>
-            <w:r>
+            <w:pPr>
+              <w:rPr>
+                <w:highlight w:val="yellow"/>
+              </w:rPr>
+            </w:pPr>
+            <w:r>
+              <w:rPr>
+                <w:highlight w:val="yellow"/>
+              </w:rPr>
               <w:t>+</w:t>
             </w:r>
           </w:p>
@@ -3256,7 +3682,15 @@
             <w:tcW w:w="567" w:type="dxa"/>
           </w:tcPr>
           <w:p>
-            <w:r>
+            <w:pPr>
+              <w:rPr>
+                <w:highlight w:val="yellow"/>
+              </w:rPr>
+            </w:pPr>
+            <w:r>
+              <w:rPr>
+                <w:highlight w:val="yellow"/>
+              </w:rPr>
               <w:t>+</w:t>
             </w:r>
           </w:p>
@@ -3266,7 +3700,15 @@
             <w:tcW w:w="567" w:type="dxa"/>
           </w:tcPr>
           <w:p>
-            <w:r>
+            <w:pPr>
+              <w:rPr>
+                <w:highlight w:val="yellow"/>
+              </w:rPr>
+            </w:pPr>
+            <w:r>
+              <w:rPr>
+                <w:highlight w:val="yellow"/>
+              </w:rPr>
               <w:t>+</w:t>
             </w:r>
           </w:p>
@@ -3276,7 +3718,15 @@
             <w:tcW w:w="567" w:type="dxa"/>
           </w:tcPr>
           <w:p>
-            <w:r>
+            <w:pPr>
+              <w:rPr>
+                <w:highlight w:val="yellow"/>
+              </w:rPr>
+            </w:pPr>
+            <w:r>
+              <w:rPr>
+                <w:highlight w:val="yellow"/>
+              </w:rPr>
               <w:t>+</w:t>
             </w:r>
           </w:p>
@@ -3286,7 +3736,15 @@
             <w:tcW w:w="567" w:type="dxa"/>
           </w:tcPr>
           <w:p>
-            <w:r>
+            <w:pPr>
+              <w:rPr>
+                <w:highlight w:val="yellow"/>
+              </w:rPr>
+            </w:pPr>
+            <w:r>
+              <w:rPr>
+                <w:highlight w:val="yellow"/>
+              </w:rPr>
               <w:t>+</w:t>
             </w:r>
           </w:p>
@@ -3296,7 +3754,15 @@
             <w:tcW w:w="567" w:type="dxa"/>
           </w:tcPr>
           <w:p>
-            <w:r>
+            <w:pPr>
+              <w:rPr>
+                <w:highlight w:val="yellow"/>
+              </w:rPr>
+            </w:pPr>
+            <w:r>
+              <w:rPr>
+                <w:highlight w:val="yellow"/>
+              </w:rPr>
               <w:t>+</w:t>
             </w:r>
           </w:p>
@@ -3306,7 +3772,15 @@
             <w:tcW w:w="709" w:type="dxa"/>
           </w:tcPr>
           <w:p>
-            <w:r>
+            <w:pPr>
+              <w:rPr>
+                <w:highlight w:val="yellow"/>
+              </w:rPr>
+            </w:pPr>
+            <w:r>
+              <w:rPr>
+                <w:highlight w:val="yellow"/>
+              </w:rPr>
               <w:t>+</w:t>
             </w:r>
           </w:p>
@@ -3316,7 +3790,15 @@
             <w:tcW w:w="708" w:type="dxa"/>
           </w:tcPr>
           <w:p>
-            <w:r>
+            <w:pPr>
+              <w:rPr>
+                <w:highlight w:val="yellow"/>
+              </w:rPr>
+            </w:pPr>
+            <w:r>
+              <w:rPr>
+                <w:highlight w:val="yellow"/>
+              </w:rPr>
               <w:t>+</w:t>
             </w:r>
           </w:p>
@@ -3326,7 +3808,15 @@
             <w:tcW w:w="709" w:type="dxa"/>
           </w:tcPr>
           <w:p>
-            <w:r>
+            <w:pPr>
+              <w:rPr>
+                <w:highlight w:val="yellow"/>
+              </w:rPr>
+            </w:pPr>
+            <w:r>
+              <w:rPr>
+                <w:highlight w:val="yellow"/>
+              </w:rPr>
               <w:t>+</w:t>
             </w:r>
           </w:p>
@@ -3336,7 +3826,15 @@
             <w:tcW w:w="709" w:type="dxa"/>
           </w:tcPr>
           <w:p>
-            <w:r>
+            <w:pPr>
+              <w:rPr>
+                <w:highlight w:val="yellow"/>
+              </w:rPr>
+            </w:pPr>
+            <w:r>
+              <w:rPr>
+                <w:highlight w:val="yellow"/>
+              </w:rPr>
               <w:t>+</w:t>
             </w:r>
           </w:p>
@@ -3358,7 +3856,15 @@
             <w:tcW w:w="567" w:type="dxa"/>
           </w:tcPr>
           <w:p>
-            <w:r>
+            <w:pPr>
+              <w:rPr>
+                <w:highlight w:val="yellow"/>
+              </w:rPr>
+            </w:pPr>
+            <w:r>
+              <w:rPr>
+                <w:highlight w:val="yellow"/>
+              </w:rPr>
               <w:t>+</w:t>
             </w:r>
           </w:p>
@@ -3370,11 +3876,13 @@
           <w:p>
             <w:pPr>
               <w:rPr>
+                <w:highlight w:val="yellow"/>
                 <w:lang w:val="en-US"/>
               </w:rPr>
             </w:pPr>
             <w:r>
               <w:rPr>
+                <w:highlight w:val="yellow"/>
                 <w:lang w:val="en-US"/>
               </w:rPr>
               <w:t>-</w:t>
@@ -3388,11 +3896,13 @@
           <w:p>
             <w:pPr>
               <w:rPr>
+                <w:highlight w:val="yellow"/>
                 <w:lang w:val="en-US"/>
               </w:rPr>
             </w:pPr>
             <w:r>
               <w:rPr>
+                <w:highlight w:val="yellow"/>
                 <w:lang w:val="en-US"/>
               </w:rPr>
               <w:t>-</w:t>
@@ -3406,11 +3916,13 @@
           <w:p>
             <w:pPr>
               <w:rPr>
+                <w:highlight w:val="yellow"/>
                 <w:lang w:val="en-US"/>
               </w:rPr>
             </w:pPr>
             <w:r>
               <w:rPr>
+                <w:highlight w:val="yellow"/>
                 <w:lang w:val="en-US"/>
               </w:rPr>
               <w:t>-</w:t>
@@ -3424,11 +3936,13 @@
           <w:p>
             <w:pPr>
               <w:rPr>
+                <w:highlight w:val="yellow"/>
                 <w:lang w:val="en-US"/>
               </w:rPr>
             </w:pPr>
             <w:r>
               <w:rPr>
+                <w:highlight w:val="yellow"/>
                 <w:lang w:val="en-US"/>
               </w:rPr>
               <w:t>-</w:t>
@@ -3442,11 +3956,13 @@
           <w:p>
             <w:pPr>
               <w:rPr>
+                <w:highlight w:val="yellow"/>
                 <w:lang w:val="en-US"/>
               </w:rPr>
             </w:pPr>
             <w:r>
               <w:rPr>
+                <w:highlight w:val="yellow"/>
                 <w:lang w:val="en-US"/>
               </w:rPr>
               <w:t>-</w:t>
@@ -3460,11 +3976,13 @@
           <w:p>
             <w:pPr>
               <w:rPr>
+                <w:highlight w:val="yellow"/>
                 <w:lang w:val="en-US"/>
               </w:rPr>
             </w:pPr>
             <w:r>
               <w:rPr>
+                <w:highlight w:val="yellow"/>
                 <w:lang w:val="en-US"/>
               </w:rPr>
               <w:t>-</w:t>
@@ -3478,11 +3996,13 @@
           <w:p>
             <w:pPr>
               <w:rPr>
+                <w:highlight w:val="yellow"/>
                 <w:lang w:val="en-US"/>
               </w:rPr>
             </w:pPr>
             <w:r>
               <w:rPr>
+                <w:highlight w:val="yellow"/>
                 <w:lang w:val="en-US"/>
               </w:rPr>
               <w:t>-</w:t>
@@ -3494,7 +4014,15 @@
             <w:tcW w:w="567" w:type="dxa"/>
           </w:tcPr>
           <w:p>
-            <w:r>
+            <w:pPr>
+              <w:rPr>
+                <w:highlight w:val="yellow"/>
+              </w:rPr>
+            </w:pPr>
+            <w:r>
+              <w:rPr>
+                <w:highlight w:val="yellow"/>
+              </w:rPr>
               <w:t>+</w:t>
             </w:r>
           </w:p>
@@ -3506,11 +4034,13 @@
           <w:p>
             <w:pPr>
               <w:rPr>
+                <w:highlight w:val="yellow"/>
                 <w:lang w:val="en-US"/>
               </w:rPr>
             </w:pPr>
             <w:r>
               <w:rPr>
+                <w:highlight w:val="yellow"/>
                 <w:lang w:val="en-US"/>
               </w:rPr>
               <w:t>-</w:t>
@@ -3524,11 +4054,13 @@
           <w:p>
             <w:pPr>
               <w:rPr>
+                <w:highlight w:val="yellow"/>
                 <w:lang w:val="en-US"/>
               </w:rPr>
             </w:pPr>
             <w:r>
               <w:rPr>
+                <w:highlight w:val="yellow"/>
                 <w:lang w:val="en-US"/>
               </w:rPr>
               <w:t>-</w:t>
@@ -3542,11 +4074,13 @@
           <w:p>
             <w:pPr>
               <w:rPr>
+                <w:highlight w:val="yellow"/>
                 <w:lang w:val="en-US"/>
               </w:rPr>
             </w:pPr>
             <w:r>
               <w:rPr>
+                <w:highlight w:val="yellow"/>
                 <w:lang w:val="en-US"/>
               </w:rPr>
               <w:t>-</w:t>
@@ -3560,11 +4094,13 @@
           <w:p>
             <w:pPr>
               <w:rPr>
+                <w:highlight w:val="yellow"/>
                 <w:lang w:val="en-US"/>
               </w:rPr>
             </w:pPr>
             <w:r>
               <w:rPr>
+                <w:highlight w:val="yellow"/>
                 <w:lang w:val="en-US"/>
               </w:rPr>
               <w:t>-</w:t>
@@ -3602,7 +4138,37 @@
         <w:pStyle w:val="afff2"/>
       </w:pPr>
       <w:r>
-        <w:t>В - профилактическое восстановление, К - профилактический контроль, К1 - первый профилактический контроль, Н - проверка при новом включении (наладка), ТК - технический контроль.</w:t>
+        <w:t>В</w:t>
+      </w:r>
+      <w:r>
+        <w:t xml:space="preserve"> – </w:t>
+      </w:r>
+      <w:r>
+        <w:t xml:space="preserve">профилактическое восстановление, К </w:t>
+      </w:r>
+      <w:r>
+        <w:t xml:space="preserve">– </w:t>
+      </w:r>
+      <w:r>
+        <w:t xml:space="preserve">профилактический контроль, К1 </w:t>
+      </w:r>
+      <w:r>
+        <w:t xml:space="preserve">– </w:t>
+      </w:r>
+      <w:r>
+        <w:t xml:space="preserve">первый профилактический контроль, Н </w:t>
+      </w:r>
+      <w:r>
+        <w:t xml:space="preserve">– </w:t>
+      </w:r>
+      <w:r>
+        <w:t xml:space="preserve">проверка при новом включении (наладка), ТК </w:t>
+      </w:r>
+      <w:r>
+        <w:t xml:space="preserve">– </w:t>
+      </w:r>
+      <w:r>
+        <w:t>технический контроль.</w:t>
       </w:r>
     </w:p>
     <w:p>
@@ -3620,6 +4186,7 @@
     <w:p>
       <w:pPr>
         <w:pStyle w:val="afff2"/>
+        <w:ind w:firstLine="0"/>
         <w:rPr>
           <w:snapToGrid w:val="0"/>
         </w:rPr>
@@ -3640,6 +4207,7 @@
     <w:p>
       <w:pPr>
         <w:pStyle w:val="afff2"/>
+        <w:ind w:firstLine="0"/>
         <w:rPr>
           <w:snapToGrid w:val="0"/>
         </w:rPr>
@@ -3668,6 +4236,7 @@
     <w:p>
       <w:pPr>
         <w:pStyle w:val="afff2"/>
+        <w:ind w:firstLine="0"/>
         <w:rPr>
           <w:b/>
           <w:i/>
@@ -3700,6 +4269,7 @@
     <w:p>
       <w:pPr>
         <w:pStyle w:val="afff2"/>
+        <w:ind w:firstLine="0"/>
         <w:rPr>
           <w:b/>
           <w:snapToGrid w:val="0"/>
@@ -3733,6 +4303,7 @@
     <w:p>
       <w:pPr>
         <w:pStyle w:val="afff2"/>
+        <w:ind w:firstLine="0"/>
         <w:rPr>
           <w:b/>
           <w:i/>
@@ -3759,65 +4330,14 @@
     </w:p>
     <w:p>
       <w:pPr>
-        <w:pStyle w:val="afff2"/>
-        <w:ind w:right="282"/>
-      </w:pPr>
-    </w:p>
-    <w:p>
-      <w:pPr>
-        <w:pStyle w:val="afff2"/>
-        <w:tabs>
-          <w:tab w:val="left" w:pos="3444"/>
-        </w:tabs>
-        <w:ind w:right="282"/>
-      </w:pPr>
-      <w:r>
-        <w:tab/>
-      </w:r>
-    </w:p>
-    <w:p>
-      <w:pPr>
-        <w:pStyle w:val="afff2"/>
-        <w:rPr>
-          <w:i/>
-          <w:iCs/>
-          <w:color w:val="BFBFBF" w:themeColor="background1" w:themeShade="BF"/>
-          <w:sz w:val="20"/>
-          <w:szCs w:val="20"/>
-        </w:rPr>
-      </w:pPr>
-    </w:p>
-    <w:p/>
-    <w:p/>
-    <w:p>
-      <w:pPr>
         <w:tabs>
           <w:tab w:val="left" w:pos="2850"/>
         </w:tabs>
-        <w:rPr>
-          <w:bCs/>
-          <w:i/>
-          <w:iCs/>
-          <w:color w:val="BFBFBF" w:themeColor="background1" w:themeShade="BF"/>
-          <w:sz w:val="20"/>
-        </w:rPr>
-      </w:pPr>
-      <w:r>
-        <w:rPr>
-          <w:bCs/>
-          <w:i/>
-          <w:iCs/>
-          <w:color w:val="BFBFBF" w:themeColor="background1" w:themeShade="BF"/>
-          <w:sz w:val="20"/>
-        </w:rPr>
-        <w:tab/>
-      </w:r>
+      </w:pPr>
     </w:p>
     <w:p>
       <w:pPr>
-        <w:tabs>
-          <w:tab w:val="left" w:pos="2850"/>
-        </w:tabs>
+        <w:pStyle w:val="13"/>
         <w:sectPr>
           <w:headerReference w:type="first" r:id="rId12"/>
           <w:footerReference w:type="first" r:id="rId13"/>
@@ -3828,9 +4348,6 @@
           <w:docGrid w:linePitch="360"/>
         </w:sectPr>
       </w:pPr>
-      <w:r>
-        <w:tab/>
-      </w:r>
     </w:p>
     <w:p>
       <w:pPr>
@@ -6007,6 +6524,8 @@
     <w:r>
       <w:rPr>
         <w:rStyle w:val="afff3"/>
+        <w:sz w:val="20"/>
+        <w:szCs w:val="16"/>
       </w:rPr>
       <w:t>Протокол наладки</w:t>
     </w:r>
@@ -6200,6 +6719,8 @@
     <w:r>
       <w:rPr>
         <w:rStyle w:val="afff3"/>
+        <w:sz w:val="20"/>
+        <w:szCs w:val="16"/>
       </w:rPr>
       <w:t>Протокол наладки</w:t>
     </w:r>
@@ -6272,7 +6793,7 @@
         <w:sz w:val="20"/>
         <w:szCs w:val="16"/>
       </w:rPr>
-      <w:t>Бланк уставок</w:t>
+      <w:t>Протокол наладки</w:t>
     </w:r>
     <w:r>
       <w:rPr>
@@ -6360,7 +6881,7 @@
         <w:sz w:val="20"/>
         <w:szCs w:val="16"/>
       </w:rPr>
-      <w:t xml:space="preserve">Отсутствует</w:t>
+      <w:t xml:space="preserve">ЮТКБ.656463.XXX-024 ПН</w:t>
     </w:r>
     <w:r>
       <w:rPr>
@@ -6421,7 +6942,7 @@
         <w:szCs w:val="16"/>
         <w:lang w:val="en-US"/>
       </w:rPr>
-      <w:t xml:space="preserve">15.09.2026</w:t>
+      <w:t xml:space="preserve">01.10.2026</w:t>
     </w:r>
     <w:r>
       <w:rPr>
@@ -6439,7 +6960,7 @@
         <w:sz w:val="20"/>
         <w:szCs w:val="16"/>
       </w:rPr>
-      <w:t xml:space="preserve">ШЭТ 210.05-0</w:t>
+      <w:t xml:space="preserve">ШЭТ 210.05-0-ЮИРЗ</w:t>
     </w:r>
   </w:p>
 </w:hdr>
@@ -6450,33 +6971,25 @@
   <w:p>
     <w:pPr>
       <w:pStyle w:val="afff5"/>
-      <w:rPr>
-        <w:lang w:val="en-US"/>
-      </w:rPr>
-    </w:pPr>
-  </w:p>
-  <w:p>
-    <w:pPr>
-      <w:pStyle w:val="afff5"/>
-      <w:tabs>
-        <w:tab w:val="clear" w:pos="4677"/>
-        <w:tab w:val="clear" w:pos="9355"/>
-        <w:tab w:val="center" w:pos="1937"/>
-      </w:tabs>
-      <w:jc w:val="right"/>
-      <w:rPr>
-        <w:lang w:val="en-US"/>
-      </w:rPr>
+      <w:spacing w:before="240" w:after="240" w:line="240" w:lineRule="auto"/>
     </w:pPr>
     <w:r>
       <w:rPr>
         <w:noProof/>
       </w:rPr>
       <w:drawing>
-        <wp:inline distT="0" distB="0" distL="0" distR="0" wp14:anchorId="2C1CEA65" wp14:editId="4D801B47">
-          <wp:extent cx="2728595" cy="554134"/>
+        <wp:anchor distT="0" distB="0" distL="114300" distR="114300" simplePos="0" relativeHeight="251658240" behindDoc="0" locked="0" layoutInCell="1" allowOverlap="1" wp14:anchorId="4BEDB74C" wp14:editId="65F6DE25">
+          <wp:simplePos x="0" y="0"/>
+          <wp:positionH relativeFrom="margin">
+            <wp:align>right</wp:align>
+          </wp:positionH>
+          <wp:positionV relativeFrom="paragraph">
+            <wp:posOffset>71755</wp:posOffset>
+          </wp:positionV>
+          <wp:extent cx="3239876" cy="657225"/>
           <wp:effectExtent l="0" t="0" r="0" b="0"/>
-          <wp:docPr id="1" name="Рисунок 1"/>
+          <wp:wrapNone/>
+          <wp:docPr id="1" name="Рисунок 2"/>
           <wp:cNvGraphicFramePr>
             <a:graphicFrameLocks xmlns:a="http://schemas.openxmlformats.org/drawingml/2006/main" noChangeAspect="1"/>
           </wp:cNvGraphicFramePr>
@@ -6502,7 +7015,7 @@
                 <pic:spPr>
                   <a:xfrm>
                     <a:off x="0" y="0"/>
-                    <a:ext cx="3083994" cy="626310"/>
+                    <a:ext cx="3239876" cy="657225"/>
                   </a:xfrm>
                   <a:prstGeom prst="rect">
                     <a:avLst/>
@@ -6511,8 +7024,26 @@
               </pic:pic>
             </a:graphicData>
           </a:graphic>
-        </wp:inline>
+          <wp14:sizeRelH relativeFrom="margin">
+            <wp14:pctWidth>0</wp14:pctWidth>
+          </wp14:sizeRelH>
+          <wp14:sizeRelV relativeFrom="margin">
+            <wp14:pctHeight>0</wp14:pctHeight>
+          </wp14:sizeRelV>
+        </wp:anchor>
       </w:drawing>
+    </w:r>
+    <w:r>
+      <w:t>Код ОКПД-2: 27.12.31.000</w:t>
+    </w:r>
+  </w:p>
+  <w:p>
+    <w:pPr>
+      <w:pStyle w:val="afff5"/>
+      <w:spacing w:before="0" w:after="0" w:line="240" w:lineRule="auto"/>
+    </w:pPr>
+    <w:r>
+      <w:t>Код ТН ВЭД: 8537 10 980 0</w:t>
     </w:r>
   </w:p>
   <w:p>
@@ -6521,11 +7052,7 @@
       <w:pBdr>
         <w:bottom w:val="single" w:sz="12" w:space="1" w:color="365F91" w:themeColor="accent1" w:themeShade="BF"/>
       </w:pBdr>
-      <w:tabs>
-        <w:tab w:val="clear" w:pos="4677"/>
-        <w:tab w:val="clear" w:pos="9355"/>
-        <w:tab w:val="center" w:pos="1937"/>
-      </w:tabs>
+      <w:spacing w:after="0" w:line="240" w:lineRule="auto"/>
     </w:pPr>
   </w:p>
 </w:hdr>
@@ -6556,7 +7083,7 @@
         <w:sz w:val="20"/>
         <w:szCs w:val="16"/>
       </w:rPr>
-      <w:t xml:space="preserve">Отсутствует</w:t>
+      <w:t xml:space="preserve">ЮТКБ.656463.XXX-024 ПН</w:t>
     </w:r>
     <w:r>
       <w:rPr>
@@ -6617,7 +7144,7 @@
         <w:szCs w:val="16"/>
         <w:lang w:val="en-US"/>
       </w:rPr>
-      <w:t xml:space="preserve">15.09.2026</w:t>
+      <w:t xml:space="preserve">01.10.2026</w:t>
     </w:r>
     <w:r>
       <w:rPr>
@@ -6635,7 +7162,7 @@
         <w:sz w:val="20"/>
         <w:szCs w:val="16"/>
       </w:rPr>
-      <w:t xml:space="preserve">ШЭТ 210.05-0</w:t>
+      <w:t xml:space="preserve">ШЭТ 210.05-0-ЮИРЗ</w:t>
     </w:r>
   </w:p>
 </w:hdr>
@@ -6666,7 +7193,7 @@
         <w:sz w:val="20"/>
         <w:szCs w:val="16"/>
       </w:rPr>
-      <w:t xml:space="preserve">Отсутствует</w:t>
+      <w:t xml:space="preserve">ЮТКБ.656463.XXX-024 ПН</w:t>
     </w:r>
     <w:r>
       <w:rPr>
@@ -6727,7 +7254,7 @@
         <w:szCs w:val="16"/>
         <w:lang w:val="en-US"/>
       </w:rPr>
-      <w:t xml:space="preserve">15.09.2026</w:t>
+      <w:t xml:space="preserve">01.10.2026</w:t>
     </w:r>
     <w:r>
       <w:rPr>
@@ -6745,7 +7272,7 @@
         <w:sz w:val="20"/>
         <w:szCs w:val="16"/>
       </w:rPr>
-      <w:t xml:space="preserve">ШЭТ 210.05-0</w:t>
+      <w:t xml:space="preserve">ШЭТ 210.05-0-ЮИРЗ</w:t>
     </w:r>
   </w:p>
 </w:hdr>
@@ -11260,7 +11787,7 @@
     </w:lvl>
   </w:abstractNum>
   <w:abstractNum w:abstractNumId="40">
-    <w:nsid w:val="00D2E033"/>
+    <w:nsid w:val="03031B76"/>
     <w:multiLevelType w:val="multilevel"/>
     <w:lvl w:ilvl="0">
       <w:numFmt w:val="bullet"/>
@@ -17510,6 +18037,52 @@
       </w:tcPr>
     </w:tblStylePr>
   </w:style>
+  <w:style w:type="paragraph" w:styleId="HTML">
+    <w:name w:val="HTML Preformatted"/>
+    <w:basedOn w:val="af"/>
+    <w:link w:val="HTML0"/>
+    <w:uiPriority w:val="99"/>
+    <w:unhideWhenUsed/>
+    <w:rsid w:val="0044450B"/>
+    <w:pPr>
+      <w:tabs>
+        <w:tab w:val="left" w:pos="916"/>
+        <w:tab w:val="left" w:pos="1832"/>
+        <w:tab w:val="left" w:pos="2748"/>
+        <w:tab w:val="left" w:pos="3664"/>
+        <w:tab w:val="left" w:pos="4580"/>
+        <w:tab w:val="left" w:pos="5496"/>
+        <w:tab w:val="left" w:pos="6412"/>
+        <w:tab w:val="left" w:pos="7328"/>
+        <w:tab w:val="left" w:pos="8244"/>
+        <w:tab w:val="left" w:pos="9160"/>
+        <w:tab w:val="left" w:pos="10076"/>
+        <w:tab w:val="left" w:pos="10992"/>
+        <w:tab w:val="left" w:pos="11908"/>
+        <w:tab w:val="left" w:pos="12824"/>
+        <w:tab w:val="left" w:pos="13740"/>
+        <w:tab w:val="left" w:pos="14656"/>
+      </w:tabs>
+      <w:spacing w:before="0" w:after="0" w:line="240" w:lineRule="auto"/>
+    </w:pPr>
+    <w:rPr>
+      <w:rFonts w:ascii="Courier New" w:hAnsi="Courier New" w:cs="Courier New"/>
+      <w:sz w:val="20"/>
+    </w:rPr>
+  </w:style>
+  <w:style w:type="character" w:customStyle="1" w:styleId="HTML0">
+    <w:name w:val="Стандартный HTML Знак"/>
+    <w:basedOn w:val="af0"/>
+    <w:link w:val="HTML"/>
+    <w:uiPriority w:val="99"/>
+    <w:rsid w:val="0044450B"/>
+    <w:rPr>
+      <w:rFonts w:ascii="Courier New" w:eastAsia="Times New Roman" w:hAnsi="Courier New" w:cs="Courier New"/>
+      <w:sz w:val="20"/>
+      <w:szCs w:val="20"/>
+      <w:lang w:eastAsia="ru-RU"/>
+    </w:rPr>
+  </w:style>
 </w:styles>
 </file>
 

</xml_diff>